<commit_message>
fix(smb-c3): SMB-30 section 6 heading drops its dangling from (NIT 1)
</commit_message>
<xml_diff>
--- a/artifacts/SMB-30/build/weekly-owner-report-template.docx
+++ b/artifacts/SMB-30/build/weekly-owner-report-template.docx
@@ -2073,13 +2073,13 @@
       </w:r>
     </w:p>
     <w:bookmarkEnd w:id="27"/>
-    <w:bookmarkStart w:id="28" w:name="before-this-report-is-generated-from"/>
+    <w:bookmarkStart w:id="28" w:name="before-this-report-is-generated"/>
     <w:p>
       <w:pPr>
         <w:pStyle w:val="Heading2"/>
       </w:pPr>
       <w:r>
-        <w:t xml:space="preserve">6. Before this report is generated from</w:t>
+        <w:t xml:space="preserve">6. Before this report is generated</w:t>
       </w:r>
     </w:p>
     <w:p>

</xml_diff>